<commit_message>
updated repo with figure
</commit_message>
<xml_diff>
--- a/training_data/output_synthetic/V2/Repo_Synthetic Data Generation.docx
+++ b/training_data/output_synthetic/V2/Repo_Synthetic Data Generation.docx
@@ -21,125 +21,181 @@
     </w:p>
     <w:p>
       <w:pPr>
-        <w:pStyle w:val="NormalWeb"/>
         <w:jc w:val="both"/>
+        <w:rPr>
+          <w:rFonts w:ascii="Times New Roman" w:eastAsia="Times New Roman" w:hAnsi="Times New Roman" w:cs="Times New Roman" w:hint="eastAsia"/>
+          <w:kern w:val="0"/>
+          <w14:ligatures w14:val="none"/>
+        </w:rPr>
       </w:pPr>
       <w:r>
-        <w:t>Prior to synthetic data generation, the raw collected time-series data were preprocessed to ensure physical consistency. All raw signals were converted into physical units (nanometers) using a custom preprocessing script (</w:t>
-      </w:r>
-      <w:r>
         <w:rPr>
-          <w:rStyle w:val="HTMLCode"/>
-          <w:rFonts w:ascii="Times New Roman" w:eastAsiaTheme="majorEastAsia" w:hAnsi="Times New Roman" w:cs="Times New Roman"/>
-          <w:sz w:val="24"/>
-          <w:szCs w:val="24"/>
+          <w:rFonts w:ascii="Times New Roman" w:eastAsia="Times New Roman" w:hAnsi="Times New Roman" w:cs="Times New Roman"/>
+          <w:kern w:val="0"/>
+          <w14:ligatures w14:val="none"/>
         </w:rPr>
-        <w:t>process_raw.py</w:t>
-      </w:r>
-      <w:r>
-        <w:t>). This step standardizes the data representation and provides a reliable input for subsequent augmentation and analysis.</w:t>
+        <w:t>Prior to synthetic data generation, the raw collected time-series data were preprocessed to ensure physical consistency. All raw signals were converted into physical units (nanometers) using a custom preprocessing script (process_raw.py). This preprocessing step standardizes the data representation and provides reliable inputs for subsequent data augmentation and analysis.</w:t>
       </w:r>
     </w:p>
     <w:p>
       <w:pPr>
-        <w:pStyle w:val="NormalWeb"/>
         <w:jc w:val="both"/>
+        <w:rPr>
+          <w:rFonts w:ascii="Times New Roman" w:eastAsia="Times New Roman" w:hAnsi="Times New Roman" w:cs="Times New Roman" w:hint="eastAsia"/>
+          <w:kern w:val="0"/>
+          <w14:ligatures w14:val="none"/>
+        </w:rPr>
       </w:pPr>
       <w:r>
+        <w:rPr>
+          <w:rFonts w:ascii="Times New Roman" w:eastAsia="Times New Roman" w:hAnsi="Times New Roman" w:cs="Times New Roman"/>
+          <w:kern w:val="0"/>
+          <w14:ligatures w14:val="none"/>
+        </w:rPr>
         <w:t xml:space="preserve">To expand the dataset and improve model robustness, a time-series data augmentation pipeline was implemented using the </w:t>
       </w:r>
       <w:proofErr w:type="spellStart"/>
       <w:r>
         <w:rPr>
-          <w:rStyle w:val="Strong"/>
-          <w:rFonts w:eastAsiaTheme="majorEastAsia"/>
+          <w:rFonts w:ascii="Times New Roman" w:eastAsia="Times New Roman" w:hAnsi="Times New Roman" w:cs="Times New Roman"/>
+          <w:kern w:val="0"/>
+          <w14:ligatures w14:val="none"/>
         </w:rPr>
         <w:t>tsaug</w:t>
       </w:r>
       <w:proofErr w:type="spellEnd"/>
       <w:r>
-        <w:t xml:space="preserve"> library. Three augmentation strategies were applied. First, </w:t>
-      </w:r>
-      <w:r>
         <w:rPr>
-          <w:rStyle w:val="Strong"/>
-          <w:rFonts w:eastAsiaTheme="majorEastAsia"/>
+          <w:rFonts w:ascii="Times New Roman" w:eastAsia="Times New Roman" w:hAnsi="Times New Roman" w:cs="Times New Roman"/>
+          <w:kern w:val="0"/>
+          <w14:ligatures w14:val="none"/>
         </w:rPr>
-        <w:t>Time Warp augmentation</w:t>
-      </w:r>
-      <w:r>
-        <w:t xml:space="preserve"> was used to modify the temporal dynamics of the signals by locally accelerating or decelerating the time axis. Three intensity levels were considered to simulate different degrees of temporal distortion, including mild (maximum speed ratio of 1.2), moderate (1.5), and strong (1.8). Second, </w:t>
-      </w:r>
-      <w:r>
-        <w:rPr>
-          <w:rStyle w:val="Strong"/>
-          <w:rFonts w:eastAsiaTheme="majorEastAsia"/>
-        </w:rPr>
-        <w:t>Reverse augmentation</w:t>
-      </w:r>
-      <w:r>
-        <w:t xml:space="preserve"> was applied by reversing the temporal order of the time series, preserving signal amplitude while altering temporal direction. Third, </w:t>
-      </w:r>
-      <w:r>
-        <w:rPr>
-          <w:rStyle w:val="Strong"/>
-          <w:rFonts w:eastAsiaTheme="majorEastAsia"/>
-        </w:rPr>
-        <w:t>Pool augmentation</w:t>
-      </w:r>
-      <w:r>
-        <w:t xml:space="preserve"> was used to reduce temporal resolution through </w:t>
+        <w:t xml:space="preserve"> library. Three augmentation strategies were applied. Time Warp augmentation modifies temporal dynamics by locally accelerating or decelerating the time axis, with three intensity levels (mild: 1.2, moderate: 1.5, strong: 1.8) used to simulate varying degrees of temporal distortion. Reverse augmentation flips the temporal order of the time series while preserving signal amplitude characteristics. Pool augmentation reduces temporal resolution through </w:t>
       </w:r>
       <w:proofErr w:type="spellStart"/>
       <w:r>
+        <w:rPr>
+          <w:rFonts w:ascii="Times New Roman" w:eastAsia="Times New Roman" w:hAnsi="Times New Roman" w:cs="Times New Roman"/>
+          <w:kern w:val="0"/>
+          <w14:ligatures w14:val="none"/>
+        </w:rPr>
         <w:t>downsampling</w:t>
       </w:r>
       <w:proofErr w:type="spellEnd"/>
       <w:r>
+        <w:rPr>
+          <w:rFonts w:ascii="Times New Roman" w:eastAsia="Times New Roman" w:hAnsi="Times New Roman" w:cs="Times New Roman"/>
+          <w:kern w:val="0"/>
+          <w14:ligatures w14:val="none"/>
+        </w:rPr>
         <w:t>, with pooling factors of 2 and 3 to simulate lower-frequency observations.</w:t>
       </w:r>
     </w:p>
     <w:p>
       <w:pPr>
-        <w:pStyle w:val="NormalWeb"/>
         <w:jc w:val="both"/>
+        <w:rPr>
+          <w:rFonts w:ascii="Times New Roman" w:eastAsia="Times New Roman" w:hAnsi="Times New Roman" w:cs="Times New Roman"/>
+          <w:kern w:val="0"/>
+          <w14:ligatures w14:val="none"/>
+        </w:rPr>
       </w:pPr>
       <w:r>
-        <w:t xml:space="preserve">The augmentation process was executed using a dedicated script (ts_augmentation.py), where six augmented datasets were generated for each original time-series sample, including three time-warped versions with different intensity levels, one reversed version, and two pooled versions with different </w:t>
+        <w:rPr>
+          <w:rFonts w:ascii="Times New Roman" w:eastAsia="Times New Roman" w:hAnsi="Times New Roman" w:cs="Times New Roman"/>
+          <w:kern w:val="0"/>
+          <w14:ligatures w14:val="none"/>
+        </w:rPr>
+        <w:t xml:space="preserve">The augmentation process was executed using a dedicated script (ts_augmentation.py), where six augmented datasets were generated for each original time-series sample, including three time-warped variants, one reversed variant, and two pooled variants with different </w:t>
       </w:r>
       <w:proofErr w:type="spellStart"/>
       <w:r>
+        <w:rPr>
+          <w:rFonts w:ascii="Times New Roman" w:eastAsia="Times New Roman" w:hAnsi="Times New Roman" w:cs="Times New Roman"/>
+          <w:kern w:val="0"/>
+          <w14:ligatures w14:val="none"/>
+        </w:rPr>
         <w:t>downsampling</w:t>
       </w:r>
       <w:proofErr w:type="spellEnd"/>
       <w:r>
+        <w:rPr>
+          <w:rFonts w:ascii="Times New Roman" w:eastAsia="Times New Roman" w:hAnsi="Times New Roman" w:cs="Times New Roman"/>
+          <w:kern w:val="0"/>
+          <w14:ligatures w14:val="none"/>
+        </w:rPr>
         <w:t xml:space="preserve"> factors. All outputs were systematically organized in an </w:t>
       </w:r>
       <w:proofErr w:type="spellStart"/>
       <w:r>
         <w:rPr>
-          <w:rStyle w:val="HTMLCode"/>
-          <w:rFonts w:ascii="Times New Roman" w:eastAsiaTheme="majorEastAsia" w:hAnsi="Times New Roman" w:cs="Times New Roman"/>
-          <w:sz w:val="24"/>
-          <w:szCs w:val="24"/>
+          <w:rFonts w:ascii="Times New Roman" w:eastAsia="Times New Roman" w:hAnsi="Times New Roman" w:cs="Times New Roman"/>
+          <w:kern w:val="0"/>
+          <w14:ligatures w14:val="none"/>
         </w:rPr>
         <w:t>augmented_data</w:t>
       </w:r>
       <w:proofErr w:type="spellEnd"/>
       <w:r>
         <w:rPr>
-          <w:rStyle w:val="HTMLCode"/>
-          <w:rFonts w:ascii="Times New Roman" w:eastAsiaTheme="majorEastAsia" w:hAnsi="Times New Roman" w:cs="Times New Roman"/>
-          <w:sz w:val="24"/>
-          <w:szCs w:val="24"/>
+          <w:rFonts w:ascii="Times New Roman" w:eastAsia="Times New Roman" w:hAnsi="Times New Roman" w:cs="Times New Roman"/>
+          <w:kern w:val="0"/>
+          <w14:ligatures w14:val="none"/>
         </w:rPr>
-        <w:t>/</w:t>
-      </w:r>
-      <w:r>
-        <w:t xml:space="preserve"> directory. For each augmented dataset, both the numerical data (CSV format) and a corresponding visualization (PNG format) were generated, enabling efficient qualitative inspection and quantitative analysis. This augmentation framework provides a reproducible and efficient approach to generating synthetic time-series data while preserving key temporal and physical characteristics.</w:t>
+        <w:t>/ directory. For each augmented dataset, both the numerical data (CSV format) and a corresponding visualization (PNG format) were generated. Representative augmented signals produced by each method are visualized in the figures for illustrative purposes, while the complete set of augmented data is retained for further analysis and model training. This framework provides a reproducible and efficient approach to generating synthetic time-series data while preserving key temporal and physical characteristics.</w:t>
       </w:r>
     </w:p>
-    <w:p/>
+    <w:p>
+      <w:pPr>
+        <w:jc w:val="both"/>
+      </w:pPr>
+      <w:r>
+        <w:rPr>
+          <w:noProof/>
+        </w:rPr>
+        <w:drawing>
+          <wp:inline distT="0" distB="0" distL="0" distR="0" wp14:anchorId="6EF55E6D" wp14:editId="6A5AE70D">
+            <wp:extent cx="5943600" cy="3045460"/>
+            <wp:effectExtent l="0" t="0" r="0" b="2540"/>
+            <wp:docPr id="1601581972" name="Picture 1" descr="A group of blue and white bars&#10;&#10;AI-generated content may be incorrect."/>
+            <wp:cNvGraphicFramePr>
+              <a:graphicFrameLocks xmlns:a="http://schemas.openxmlformats.org/drawingml/2006/main" noChangeAspect="1"/>
+            </wp:cNvGraphicFramePr>
+            <a:graphic xmlns:a="http://schemas.openxmlformats.org/drawingml/2006/main">
+              <a:graphicData uri="http://schemas.openxmlformats.org/drawingml/2006/picture">
+                <pic:pic xmlns:pic="http://schemas.openxmlformats.org/drawingml/2006/picture">
+                  <pic:nvPicPr>
+                    <pic:cNvPr id="1601581972" name="Picture 1" descr="A group of blue and white bars&#10;&#10;AI-generated content may be incorrect."/>
+                    <pic:cNvPicPr/>
+                  </pic:nvPicPr>
+                  <pic:blipFill>
+                    <a:blip r:embed="rId5" cstate="print">
+                      <a:extLst>
+                        <a:ext uri="{28A0092B-C50C-407E-A947-70E740481C1C}">
+                          <a14:useLocalDpi xmlns:a14="http://schemas.microsoft.com/office/drawing/2010/main" val="0"/>
+                        </a:ext>
+                      </a:extLst>
+                    </a:blip>
+                    <a:stretch>
+                      <a:fillRect/>
+                    </a:stretch>
+                  </pic:blipFill>
+                  <pic:spPr>
+                    <a:xfrm>
+                      <a:off x="0" y="0"/>
+                      <a:ext cx="5943600" cy="3045460"/>
+                    </a:xfrm>
+                    <a:prstGeom prst="rect">
+                      <a:avLst/>
+                    </a:prstGeom>
+                  </pic:spPr>
+                </pic:pic>
+              </a:graphicData>
+            </a:graphic>
+          </wp:inline>
+        </w:drawing>
+      </w:r>
+    </w:p>
     <w:sectPr>
       <w:pgSz w:w="12240" w:h="15840"/>
       <w:pgMar w:top="1440" w:right="1440" w:bottom="1440" w:left="1440" w:header="720" w:footer="720" w:gutter="0"/>

</xml_diff>